<commit_message>
Manuscript R11: drop Table 1 note d on the pāi-fān count
Co-Authored-By: Claude Opus 5.5 <noreply@anthropic.com>
Claude-Session: https://claude.ai/code/session_01LmwJh5mSZgrzkCyUsBhDdt
</commit_message>
<xml_diff>
--- a/drafts/Manuscript_R11_APA.docx
+++ b/drafts/Manuscript_R11_APA.docx
@@ -2304,7 +2304,7 @@
             </w:pPr>
             <w:r/>
             <w:r>
-              <w:t>13ᵈ</w:t>
+              <w:t>13</w:t>
             </w:r>
           </w:p>
         </w:tc>
@@ -4597,7 +4597,7 @@
         <w:t>n</w:t>
       </w:r>
       <w:r>
-        <w:t xml:space="preserve"> = 20 raters). In each pair, the first row is the expected stronger-association expression. CCL documents are numbers of documents in the CCL corpus containing the RVC in its resultative use. Counts of 100 or more are estimates (raw document count × proportion of resultative uses in a checked sample), rounded to the nearest 10; counts below 100 are based on checking all matches (see text). ᵃ Excluded from the analyses of Experiment 1 (see Pair Selection); set labels follow the original design. ᵇ Mostly figurative uses. ᶜ Includes many abstract uses. ᵈ Midpoint of 11–14; some matches could not be classified with certainty.</w:t>
+        <w:t xml:space="preserve"> = 20 raters). In each pair, the first row is the expected stronger-association expression. CCL documents are numbers of documents in the CCL corpus containing the RVC in its resultative use. Counts of 100 or more are estimates (raw document count × proportion of resultative uses in a checked sample), rounded to the nearest 10; counts below 100 are based on checking all matches (see text). ᵃ Excluded from the analyses of Experiment 1 (see Pair Selection); set labels follow the original design. ᵇ Mostly figurative uses. ᶜ Includes many abstract uses.</w:t>
       </w:r>
     </w:p>
     <w:p>

</xml_diff>